<commit_message>
Session delivery status, all-trainers card, dedicated links, team rename
- Trainers accept-to-deliver and mark ONLY their own session completed;
  whole-event 'Mark completed' is admin-only (button + API guard). When
  all sessions are completed the event auto-completes.
- Event page shows a 'Trainers (N)' card listing every distinct session
  trainer with their session count and delivery status (fixes incomplete
  trainer info)
- Sessions (create + add-session) accept a dedicated meeting link; blank
  = auto-generate. Editing a session lets you paste a real Teams/Zoom link.
- Team Structure: 'Create batch' → 'Create a team'
- User guide PDF/DOCX cover now uses the official CDC Türkiye logo

Co-Authored-By: Claude Fable 5 <noreply@anthropic.com>
</commit_message>
<xml_diff>
--- a/docs/TOP-Portal-User-Guide.docx
+++ b/docs/TOP-Portal-User-Guide.docx
@@ -4,24 +4,56 @@
   <w:body>
     <w:p>
       <w:pPr>
-        <w:spacing w:before="2400"/>
-      </w:pPr>
-    </w:p>
-    <w:p>
-      <w:pPr>
-        <w:spacing w:after="60"/>
+        <w:spacing w:before="2000"/>
+      </w:pPr>
+    </w:p>
+    <w:p>
+      <w:pPr>
+        <w:spacing w:after="240"/>
         <w:jc w:val="center"/>
       </w:pPr>
       <w:r>
         <w:rPr>
-          <w:b/>
-          <w:bCs/>
-          <w:color w:val="001965"/>
-          <w:spacing w:val="40"/>
-          <w:sz w:val="28"/>
-          <w:szCs w:val="28"/>
+          <w:noProof/>
         </w:rPr>
-        <w:t>CDC TÜRKİYE</w:t>
+        <w:drawing>
+          <wp:inline distT="0" distB="0" distL="0" distR="0" wp14:anchorId="245D871D" wp14:editId="3315398E">
+            <wp:extent cx="2476500" cy="1724025"/>
+            <wp:effectExtent l="0" t="0" r="0" b="0"/>
+            <wp:docPr id="1" name="Picture 1"/>
+            <wp:cNvGraphicFramePr>
+              <a:graphicFrameLocks xmlns:a="http://schemas.openxmlformats.org/drawingml/2006/main" noChangeAspect="1"/>
+            </wp:cNvGraphicFramePr>
+            <a:graphic xmlns:a="http://schemas.openxmlformats.org/drawingml/2006/main">
+              <a:graphicData uri="http://schemas.openxmlformats.org/drawingml/2006/picture">
+                <pic:pic xmlns:pic="http://schemas.openxmlformats.org/drawingml/2006/picture">
+                  <pic:nvPicPr>
+                    <pic:cNvPr id="0" name=""/>
+                    <pic:cNvPicPr>
+                      <a:picLocks noChangeAspect="1" noChangeArrowheads="1"/>
+                    </pic:cNvPicPr>
+                  </pic:nvPicPr>
+                  <pic:blipFill>
+                    <a:blip r:embed="rId5"/>
+                    <a:srcRect/>
+                    <a:stretch>
+                      <a:fillRect/>
+                    </a:stretch>
+                  </pic:blipFill>
+                  <pic:spPr bwMode="auto">
+                    <a:xfrm>
+                      <a:off x="0" y="0"/>
+                      <a:ext cx="2476500" cy="1724025"/>
+                    </a:xfrm>
+                    <a:prstGeom prst="rect">
+                      <a:avLst/>
+                    </a:prstGeom>
+                  </pic:spPr>
+                </pic:pic>
+              </a:graphicData>
+            </a:graphic>
+          </wp:inline>
+        </w:drawing>
       </w:r>
     </w:p>
     <w:p>
@@ -89,7 +121,7 @@
         <w:pStyle w:val="Heading1"/>
         <w:spacing w:before="360" w:after="160"/>
       </w:pPr>
-      <w:bookmarkStart w:id="0" w:name="_Toc235097496"/>
+      <w:bookmarkStart w:id="0" w:name="_Toc235600015"/>
       <w:r>
         <w:t>Contents</w:t>
       </w:r>
@@ -98,7 +130,7 @@
     <w:sdt>
       <w:sdtPr>
         <w:alias w:val="Contents"/>
-        <w:id w:val="329268757"/>
+        <w:id w:val="-1269467498"/>
       </w:sdtPr>
       <w:sdtEndPr/>
       <w:sdtContent>
@@ -127,7 +159,7 @@
           <w:r>
             <w:fldChar w:fldCharType="separate"/>
           </w:r>
-          <w:hyperlink w:anchor="_Toc235097496" w:history="1">
+          <w:hyperlink w:anchor="_Toc235600015" w:history="1">
             <w:r>
               <w:rPr>
                 <w:rStyle w:val="Hyperlink"/>
@@ -151,7 +183,7 @@
               <w:rPr>
                 <w:noProof/>
               </w:rPr>
-              <w:instrText xml:space="preserve"> PAGEREF _Toc235097496 \h </w:instrText>
+              <w:instrText xml:space="preserve"> PAGEREF _Toc235600015 \h </w:instrText>
             </w:r>
             <w:r>
               <w:rPr>
@@ -194,7 +226,7 @@
               <w14:ligatures w14:val="standardContextual"/>
             </w:rPr>
           </w:pPr>
-          <w:hyperlink w:anchor="_Toc235097497" w:history="1">
+          <w:hyperlink w:anchor="_Toc235600016" w:history="1">
             <w:r>
               <w:rPr>
                 <w:rStyle w:val="Hyperlink"/>
@@ -218,7 +250,7 @@
               <w:rPr>
                 <w:noProof/>
               </w:rPr>
-              <w:instrText xml:space="preserve"> PAGEREF _Toc235097497 \h </w:instrText>
+              <w:instrText xml:space="preserve"> PAGEREF _Toc235600016 \h </w:instrText>
             </w:r>
             <w:r>
               <w:rPr>
@@ -261,7 +293,7 @@
               <w14:ligatures w14:val="standardContextual"/>
             </w:rPr>
           </w:pPr>
-          <w:hyperlink w:anchor="_Toc235097498" w:history="1">
+          <w:hyperlink w:anchor="_Toc235600017" w:history="1">
             <w:r>
               <w:rPr>
                 <w:rStyle w:val="Hyperlink"/>
@@ -285,7 +317,7 @@
               <w:rPr>
                 <w:noProof/>
               </w:rPr>
-              <w:instrText xml:space="preserve"> PAGEREF _Toc235097498 \h </w:instrText>
+              <w:instrText xml:space="preserve"> PAGEREF _Toc235600017 \h </w:instrText>
             </w:r>
             <w:r>
               <w:rPr>
@@ -328,7 +360,7 @@
               <w14:ligatures w14:val="standardContextual"/>
             </w:rPr>
           </w:pPr>
-          <w:hyperlink w:anchor="_Toc235097499" w:history="1">
+          <w:hyperlink w:anchor="_Toc235600018" w:history="1">
             <w:r>
               <w:rPr>
                 <w:rStyle w:val="Hyperlink"/>
@@ -352,7 +384,7 @@
               <w:rPr>
                 <w:noProof/>
               </w:rPr>
-              <w:instrText xml:space="preserve"> PAGEREF _Toc235097499 \h </w:instrText>
+              <w:instrText xml:space="preserve"> PAGEREF _Toc235600018 \h </w:instrText>
             </w:r>
             <w:r>
               <w:rPr>
@@ -395,7 +427,7 @@
               <w14:ligatures w14:val="standardContextual"/>
             </w:rPr>
           </w:pPr>
-          <w:hyperlink w:anchor="_Toc235097500" w:history="1">
+          <w:hyperlink w:anchor="_Toc235600019" w:history="1">
             <w:r>
               <w:rPr>
                 <w:rStyle w:val="Hyperlink"/>
@@ -419,7 +451,7 @@
               <w:rPr>
                 <w:noProof/>
               </w:rPr>
-              <w:instrText xml:space="preserve"> PAGEREF _Toc235097500 \h </w:instrText>
+              <w:instrText xml:space="preserve"> PAGEREF _Toc235600019 \h </w:instrText>
             </w:r>
             <w:r>
               <w:rPr>
@@ -462,7 +494,7 @@
               <w14:ligatures w14:val="standardContextual"/>
             </w:rPr>
           </w:pPr>
-          <w:hyperlink w:anchor="_Toc235097501" w:history="1">
+          <w:hyperlink w:anchor="_Toc235600020" w:history="1">
             <w:r>
               <w:rPr>
                 <w:rStyle w:val="Hyperlink"/>
@@ -486,7 +518,7 @@
               <w:rPr>
                 <w:noProof/>
               </w:rPr>
-              <w:instrText xml:space="preserve"> PAGEREF _Toc235097501 \h </w:instrText>
+              <w:instrText xml:space="preserve"> PAGEREF _Toc235600020 \h </w:instrText>
             </w:r>
             <w:r>
               <w:rPr>
@@ -529,7 +561,7 @@
               <w14:ligatures w14:val="standardContextual"/>
             </w:rPr>
           </w:pPr>
-          <w:hyperlink w:anchor="_Toc235097502" w:history="1">
+          <w:hyperlink w:anchor="_Toc235600021" w:history="1">
             <w:r>
               <w:rPr>
                 <w:rStyle w:val="Hyperlink"/>
@@ -553,7 +585,7 @@
               <w:rPr>
                 <w:noProof/>
               </w:rPr>
-              <w:instrText xml:space="preserve"> PAGEREF _Toc235097502 \h </w:instrText>
+              <w:instrText xml:space="preserve"> PAGEREF _Toc235600021 \h </w:instrText>
             </w:r>
             <w:r>
               <w:rPr>
@@ -596,7 +628,7 @@
               <w14:ligatures w14:val="standardContextual"/>
             </w:rPr>
           </w:pPr>
-          <w:hyperlink w:anchor="_Toc235097503" w:history="1">
+          <w:hyperlink w:anchor="_Toc235600022" w:history="1">
             <w:r>
               <w:rPr>
                 <w:rStyle w:val="Hyperlink"/>
@@ -620,7 +652,7 @@
               <w:rPr>
                 <w:noProof/>
               </w:rPr>
-              <w:instrText xml:space="preserve"> PAGEREF _Toc235097503 \h </w:instrText>
+              <w:instrText xml:space="preserve"> PAGEREF _Toc235600022 \h </w:instrText>
             </w:r>
             <w:r>
               <w:rPr>
@@ -663,7 +695,7 @@
               <w14:ligatures w14:val="standardContextual"/>
             </w:rPr>
           </w:pPr>
-          <w:hyperlink w:anchor="_Toc235097504" w:history="1">
+          <w:hyperlink w:anchor="_Toc235600023" w:history="1">
             <w:r>
               <w:rPr>
                 <w:rStyle w:val="Hyperlink"/>
@@ -687,7 +719,7 @@
               <w:rPr>
                 <w:noProof/>
               </w:rPr>
-              <w:instrText xml:space="preserve"> PAGEREF _Toc235097504 \h </w:instrText>
+              <w:instrText xml:space="preserve"> PAGEREF _Toc235600023 \h </w:instrText>
             </w:r>
             <w:r>
               <w:rPr>
@@ -730,7 +762,7 @@
               <w14:ligatures w14:val="standardContextual"/>
             </w:rPr>
           </w:pPr>
-          <w:hyperlink w:anchor="_Toc235097505" w:history="1">
+          <w:hyperlink w:anchor="_Toc235600024" w:history="1">
             <w:r>
               <w:rPr>
                 <w:rStyle w:val="Hyperlink"/>
@@ -754,7 +786,7 @@
               <w:rPr>
                 <w:noProof/>
               </w:rPr>
-              <w:instrText xml:space="preserve"> PAGEREF _Toc235097505 \h </w:instrText>
+              <w:instrText xml:space="preserve"> PAGEREF _Toc235600024 \h </w:instrText>
             </w:r>
             <w:r>
               <w:rPr>
@@ -797,7 +829,7 @@
               <w14:ligatures w14:val="standardContextual"/>
             </w:rPr>
           </w:pPr>
-          <w:hyperlink w:anchor="_Toc235097506" w:history="1">
+          <w:hyperlink w:anchor="_Toc235600025" w:history="1">
             <w:r>
               <w:rPr>
                 <w:rStyle w:val="Hyperlink"/>
@@ -821,7 +853,7 @@
               <w:rPr>
                 <w:noProof/>
               </w:rPr>
-              <w:instrText xml:space="preserve"> PAGEREF _Toc235097506 \h </w:instrText>
+              <w:instrText xml:space="preserve"> PAGEREF _Toc235600025 \h </w:instrText>
             </w:r>
             <w:r>
               <w:rPr>
@@ -864,7 +896,7 @@
               <w14:ligatures w14:val="standardContextual"/>
             </w:rPr>
           </w:pPr>
-          <w:hyperlink w:anchor="_Toc235097507" w:history="1">
+          <w:hyperlink w:anchor="_Toc235600026" w:history="1">
             <w:r>
               <w:rPr>
                 <w:rStyle w:val="Hyperlink"/>
@@ -888,7 +920,7 @@
               <w:rPr>
                 <w:noProof/>
               </w:rPr>
-              <w:instrText xml:space="preserve"> PAGEREF _Toc235097507 \h </w:instrText>
+              <w:instrText xml:space="preserve"> PAGEREF _Toc235600026 \h </w:instrText>
             </w:r>
             <w:r>
               <w:rPr>
@@ -931,7 +963,7 @@
               <w14:ligatures w14:val="standardContextual"/>
             </w:rPr>
           </w:pPr>
-          <w:hyperlink w:anchor="_Toc235097508" w:history="1">
+          <w:hyperlink w:anchor="_Toc235600027" w:history="1">
             <w:r>
               <w:rPr>
                 <w:rStyle w:val="Hyperlink"/>
@@ -955,7 +987,7 @@
               <w:rPr>
                 <w:noProof/>
               </w:rPr>
-              <w:instrText xml:space="preserve"> PAGEREF _Toc235097508 \h </w:instrText>
+              <w:instrText xml:space="preserve"> PAGEREF _Toc235600027 \h </w:instrText>
             </w:r>
             <w:r>
               <w:rPr>
@@ -998,7 +1030,7 @@
               <w14:ligatures w14:val="standardContextual"/>
             </w:rPr>
           </w:pPr>
-          <w:hyperlink w:anchor="_Toc235097509" w:history="1">
+          <w:hyperlink w:anchor="_Toc235600028" w:history="1">
             <w:r>
               <w:rPr>
                 <w:rStyle w:val="Hyperlink"/>
@@ -1022,7 +1054,7 @@
               <w:rPr>
                 <w:noProof/>
               </w:rPr>
-              <w:instrText xml:space="preserve"> PAGEREF _Toc235097509 \h </w:instrText>
+              <w:instrText xml:space="preserve"> PAGEREF _Toc235600028 \h </w:instrText>
             </w:r>
             <w:r>
               <w:rPr>
@@ -1065,7 +1097,7 @@
               <w14:ligatures w14:val="standardContextual"/>
             </w:rPr>
           </w:pPr>
-          <w:hyperlink w:anchor="_Toc235097510" w:history="1">
+          <w:hyperlink w:anchor="_Toc235600029" w:history="1">
             <w:r>
               <w:rPr>
                 <w:rStyle w:val="Hyperlink"/>
@@ -1089,7 +1121,7 @@
               <w:rPr>
                 <w:noProof/>
               </w:rPr>
-              <w:instrText xml:space="preserve"> PAGEREF _Toc235097510 \h </w:instrText>
+              <w:instrText xml:space="preserve"> PAGEREF _Toc235600029 \h </w:instrText>
             </w:r>
             <w:r>
               <w:rPr>
@@ -1132,7 +1164,7 @@
               <w14:ligatures w14:val="standardContextual"/>
             </w:rPr>
           </w:pPr>
-          <w:hyperlink w:anchor="_Toc235097511" w:history="1">
+          <w:hyperlink w:anchor="_Toc235600030" w:history="1">
             <w:r>
               <w:rPr>
                 <w:rStyle w:val="Hyperlink"/>
@@ -1156,7 +1188,7 @@
               <w:rPr>
                 <w:noProof/>
               </w:rPr>
-              <w:instrText xml:space="preserve"> PAGEREF _Toc235097511 \h </w:instrText>
+              <w:instrText xml:space="preserve"> PAGEREF _Toc235600030 \h </w:instrText>
             </w:r>
             <w:r>
               <w:rPr>
@@ -1199,7 +1231,7 @@
               <w14:ligatures w14:val="standardContextual"/>
             </w:rPr>
           </w:pPr>
-          <w:hyperlink w:anchor="_Toc235097512" w:history="1">
+          <w:hyperlink w:anchor="_Toc235600031" w:history="1">
             <w:r>
               <w:rPr>
                 <w:rStyle w:val="Hyperlink"/>
@@ -1223,7 +1255,7 @@
               <w:rPr>
                 <w:noProof/>
               </w:rPr>
-              <w:instrText xml:space="preserve"> PAGEREF _Toc235097512 \h </w:instrText>
+              <w:instrText xml:space="preserve"> PAGEREF _Toc235600031 \h </w:instrText>
             </w:r>
             <w:r>
               <w:rPr>
@@ -1266,7 +1298,7 @@
               <w14:ligatures w14:val="standardContextual"/>
             </w:rPr>
           </w:pPr>
-          <w:hyperlink w:anchor="_Toc235097513" w:history="1">
+          <w:hyperlink w:anchor="_Toc235600032" w:history="1">
             <w:r>
               <w:rPr>
                 <w:rStyle w:val="Hyperlink"/>
@@ -1290,7 +1322,7 @@
               <w:rPr>
                 <w:noProof/>
               </w:rPr>
-              <w:instrText xml:space="preserve"> PAGEREF _Toc235097513 \h </w:instrText>
+              <w:instrText xml:space="preserve"> PAGEREF _Toc235600032 \h </w:instrText>
             </w:r>
             <w:r>
               <w:rPr>
@@ -1333,7 +1365,7 @@
               <w14:ligatures w14:val="standardContextual"/>
             </w:rPr>
           </w:pPr>
-          <w:hyperlink w:anchor="_Toc235097514" w:history="1">
+          <w:hyperlink w:anchor="_Toc235600033" w:history="1">
             <w:r>
               <w:rPr>
                 <w:rStyle w:val="Hyperlink"/>
@@ -1357,7 +1389,7 @@
               <w:rPr>
                 <w:noProof/>
               </w:rPr>
-              <w:instrText xml:space="preserve"> PAGEREF _Toc235097514 \h </w:instrText>
+              <w:instrText xml:space="preserve"> PAGEREF _Toc235600033 \h </w:instrText>
             </w:r>
             <w:r>
               <w:rPr>
@@ -1401,7 +1433,7 @@
         <w:pStyle w:val="Heading1"/>
         <w:spacing w:before="360" w:after="160"/>
       </w:pPr>
-      <w:bookmarkStart w:id="1" w:name="_Toc235097497"/>
+      <w:bookmarkStart w:id="1" w:name="_Toc235600016"/>
       <w:r>
         <w:t>1. Introduction</w:t>
       </w:r>
@@ -1811,7 +1843,7 @@
         <w:pStyle w:val="Heading1"/>
         <w:spacing w:before="360" w:after="160"/>
       </w:pPr>
-      <w:bookmarkStart w:id="2" w:name="_Toc235097498"/>
+      <w:bookmarkStart w:id="2" w:name="_Toc235600017"/>
       <w:r>
         <w:t>2. Getting started</w:t>
       </w:r>
@@ -1822,7 +1854,7 @@
         <w:pStyle w:val="Heading2"/>
         <w:spacing w:before="260" w:after="120"/>
       </w:pPr>
-      <w:bookmarkStart w:id="3" w:name="_Toc235097499"/>
+      <w:bookmarkStart w:id="3" w:name="_Toc235600018"/>
       <w:r>
         <w:t>2.1 Signing in</w:t>
       </w:r>
@@ -2260,7 +2292,7 @@
         <w:pStyle w:val="Heading2"/>
         <w:spacing w:before="260" w:after="120"/>
       </w:pPr>
-      <w:bookmarkStart w:id="4" w:name="_Toc235097500"/>
+      <w:bookmarkStart w:id="4" w:name="_Toc235600019"/>
       <w:r>
         <w:t>2.2 Finding your way around</w:t>
       </w:r>
@@ -2356,7 +2388,7 @@
         <w:pStyle w:val="Heading1"/>
         <w:spacing w:before="360" w:after="160"/>
       </w:pPr>
-      <w:bookmarkStart w:id="5" w:name="_Toc235097501"/>
+      <w:bookmarkStart w:id="5" w:name="_Toc235600020"/>
       <w:r>
         <w:t>3. How events and sessions work</w:t>
       </w:r>
@@ -2477,7 +2509,7 @@
         <w:pStyle w:val="Heading2"/>
         <w:spacing w:before="260" w:after="120"/>
       </w:pPr>
-      <w:bookmarkStart w:id="6" w:name="_Toc235097502"/>
+      <w:bookmarkStart w:id="6" w:name="_Toc235600021"/>
       <w:r>
         <w:t>3.1 Outlook calendar — per session</w:t>
       </w:r>
@@ -2536,7 +2568,7 @@
         <w:pStyle w:val="Heading2"/>
         <w:spacing w:before="260" w:after="120"/>
       </w:pPr>
-      <w:bookmarkStart w:id="7" w:name="_Toc235097503"/>
+      <w:bookmarkStart w:id="7" w:name="_Toc235600022"/>
       <w:r>
         <w:t>3.2 Event visibility — by batch</w:t>
       </w:r>
@@ -2555,7 +2587,7 @@
         <w:pStyle w:val="Heading2"/>
         <w:spacing w:before="260" w:after="120"/>
       </w:pPr>
-      <w:bookmarkStart w:id="8" w:name="_Toc235097504"/>
+      <w:bookmarkStart w:id="8" w:name="_Toc235600023"/>
       <w:r>
         <w:t>3.3 Registration window</w:t>
       </w:r>
@@ -2579,7 +2611,7 @@
         <w:pStyle w:val="Heading1"/>
         <w:spacing w:before="360" w:after="160"/>
       </w:pPr>
-      <w:bookmarkStart w:id="9" w:name="_Toc235097505"/>
+      <w:bookmarkStart w:id="9" w:name="_Toc235600024"/>
       <w:r>
         <w:t>4. Guide for Trainees</w:t>
       </w:r>
@@ -2730,7 +2762,7 @@
         <w:pStyle w:val="Heading1"/>
         <w:spacing w:before="360" w:after="160"/>
       </w:pPr>
-      <w:bookmarkStart w:id="10" w:name="_Toc235097506"/>
+      <w:bookmarkStart w:id="10" w:name="_Toc235600025"/>
       <w:r>
         <w:t>5. Guide for Trainers</w:t>
       </w:r>
@@ -2869,7 +2901,7 @@
         <w:pStyle w:val="Heading1"/>
         <w:spacing w:before="360" w:after="160"/>
       </w:pPr>
-      <w:bookmarkStart w:id="11" w:name="_Toc235097507"/>
+      <w:bookmarkStart w:id="11" w:name="_Toc235600026"/>
       <w:r>
         <w:t>6. Guide for Team Leaders</w:t>
       </w:r>
@@ -2972,7 +3004,7 @@
         <w:pStyle w:val="Heading1"/>
         <w:spacing w:before="360" w:after="160"/>
       </w:pPr>
-      <w:bookmarkStart w:id="12" w:name="_Toc235097508"/>
+      <w:bookmarkStart w:id="12" w:name="_Toc235600027"/>
       <w:r>
         <w:t>7. Guide for Administrators</w:t>
       </w:r>
@@ -2983,7 +3015,7 @@
         <w:pStyle w:val="Heading2"/>
         <w:spacing w:before="260" w:after="120"/>
       </w:pPr>
-      <w:bookmarkStart w:id="13" w:name="_Toc235097509"/>
+      <w:bookmarkStart w:id="13" w:name="_Toc235600028"/>
       <w:r>
         <w:t>7.1 Batches (master data)</w:t>
       </w:r>
@@ -3081,7 +3113,7 @@
         <w:pStyle w:val="Heading2"/>
         <w:spacing w:before="260" w:after="120"/>
       </w:pPr>
-      <w:bookmarkStart w:id="14" w:name="_Toc235097510"/>
+      <w:bookmarkStart w:id="14" w:name="_Toc235600029"/>
       <w:r>
         <w:t>7.2 People</w:t>
       </w:r>
@@ -3152,7 +3184,7 @@
         <w:pStyle w:val="Heading2"/>
         <w:spacing w:before="260" w:after="120"/>
       </w:pPr>
-      <w:bookmarkStart w:id="15" w:name="_Toc235097511"/>
+      <w:bookmarkStart w:id="15" w:name="_Toc235600030"/>
       <w:r>
         <w:t>7.3 Events</w:t>
       </w:r>
@@ -3203,7 +3235,7 @@
         <w:pStyle w:val="Heading2"/>
         <w:spacing w:before="260" w:after="120"/>
       </w:pPr>
-      <w:bookmarkStart w:id="16" w:name="_Toc235097512"/>
+      <w:bookmarkStart w:id="16" w:name="_Toc235600031"/>
       <w:r>
         <w:t>7.4 Announcements, reports &amp; settings</w:t>
       </w:r>
@@ -3279,7 +3311,7 @@
         <w:pStyle w:val="Heading1"/>
         <w:spacing w:before="360" w:after="160"/>
       </w:pPr>
-      <w:bookmarkStart w:id="17" w:name="_Toc235097513"/>
+      <w:bookmarkStart w:id="17" w:name="_Toc235600032"/>
       <w:r>
         <w:t>8. Frequently asked questions</w:t>
       </w:r>
@@ -3664,7 +3696,7 @@
         <w:pStyle w:val="Heading1"/>
         <w:spacing w:before="360" w:after="160"/>
       </w:pPr>
-      <w:bookmarkStart w:id="18" w:name="_Toc235097514"/>
+      <w:bookmarkStart w:id="18" w:name="_Toc235600033"/>
       <w:r>
         <w:t>9. Good to know (demo environment)</w:t>
       </w:r>
@@ -3736,96 +3768,64 @@
 <file path=word/numbering.xml><?xml version="1.0" encoding="utf-8"?>
 <w:numbering xmlns:wpc="http://schemas.microsoft.com/office/word/2010/wordprocessingCanvas" xmlns:cx="http://schemas.microsoft.com/office/drawing/2014/chartex" xmlns:cx1="http://schemas.microsoft.com/office/drawing/2015/9/8/chartex" xmlns:cx2="http://schemas.microsoft.com/office/drawing/2015/10/21/chartex" xmlns:cx3="http://schemas.microsoft.com/office/drawing/2016/5/9/chartex" xmlns:cx4="http://schemas.microsoft.com/office/drawing/2016/5/10/chartex" xmlns:cx5="http://schemas.microsoft.com/office/drawing/2016/5/11/chartex" xmlns:cx6="http://schemas.microsoft.com/office/drawing/2016/5/12/chartex" xmlns:cx7="http://schemas.microsoft.com/office/drawing/2016/5/13/chartex" xmlns:cx8="http://schemas.microsoft.com/office/drawing/2016/5/14/chartex" xmlns:mc="http://schemas.openxmlformats.org/markup-compatibility/2006" xmlns:aink="http://schemas.microsoft.com/office/drawing/2016/ink" xmlns:am3d="http://schemas.microsoft.com/office/drawing/2017/model3d" xmlns:o="urn:schemas-microsoft-com:office:office" xmlns:oel="http://schemas.microsoft.com/office/2019/extlst" xmlns:r="http://schemas.openxmlformats.org/officeDocument/2006/relationships" xmlns:m="http://schemas.openxmlformats.org/officeDocument/2006/math" xmlns:v="urn:schemas-microsoft-com:vml" xmlns:wp14="http://schemas.microsoft.com/office/word/2010/wordprocessingDrawing" xmlns:wp="http://schemas.openxmlformats.org/drawingml/2006/wordprocessingDrawing" xmlns:w10="urn:schemas-microsoft-com:office:word" xmlns:w="http://schemas.openxmlformats.org/wordprocessingml/2006/main" xmlns:w14="http://schemas.microsoft.com/office/word/2010/wordml" xmlns:w15="http://schemas.microsoft.com/office/word/2012/wordml" xmlns:w16cex="http://schemas.microsoft.com/office/word/2018/wordml/cex" xmlns:w16cid="http://schemas.microsoft.com/office/word/2016/wordml/cid" xmlns:w16="http://schemas.microsoft.com/office/word/2018/wordml" xmlns:w16du="http://schemas.microsoft.com/office/word/2023/wordml/word16du" xmlns:w16sdtdh="http://schemas.microsoft.com/office/word/2020/wordml/sdtdatahash" xmlns:w16sdtfl="http://schemas.microsoft.com/office/word/2024/wordml/sdtformatlock" xmlns:w16se="http://schemas.microsoft.com/office/word/2015/wordml/symex" xmlns:wpg="http://schemas.microsoft.com/office/word/2010/wordprocessingGroup" xmlns:wpi="http://schemas.microsoft.com/office/word/2010/wordprocessingInk" xmlns:wne="http://schemas.microsoft.com/office/word/2006/wordml" xmlns:wps="http://schemas.microsoft.com/office/word/2010/wordprocessingShape" mc:Ignorable="w14 w15 w16se w16cid w16 w16cex w16sdtdh w16sdtfl w16du wp14">
   <w:abstractNum w:abstractNumId="0" w15:restartNumberingAfterBreak="0">
-    <w:nsid w:val="44023FD9"/>
+    <w:nsid w:val="3D1C1362"/>
     <w:multiLevelType w:val="hybridMultilevel"/>
-    <w:tmpl w:val="EEE4572C"/>
-    <w:lvl w:ilvl="0" w:tplc="A6F21EFE">
+    <w:tmpl w:val="B1163D08"/>
+    <w:lvl w:ilvl="0" w:tplc="AF2E2A82">
       <w:start w:val="1"/>
       <w:numFmt w:val="bullet"/>
-      <w:lvlText w:val="●"/>
+      <w:lvlText w:val="•"/>
       <w:lvlJc w:val="left"/>
       <w:pPr>
-        <w:ind w:left="720" w:hanging="360"/>
+        <w:ind w:left="440" w:hanging="260"/>
       </w:pPr>
     </w:lvl>
-    <w:lvl w:ilvl="1" w:tplc="3DAAF32C">
-      <w:start w:val="1"/>
-      <w:numFmt w:val="bullet"/>
-      <w:lvlText w:val="○"/>
+    <w:lvl w:ilvl="1" w:tplc="3B885366">
+      <w:numFmt w:val="decimal"/>
+      <w:lvlText w:val=""/>
       <w:lvlJc w:val="left"/>
-      <w:pPr>
-        <w:ind w:left="1440" w:hanging="360"/>
-      </w:pPr>
     </w:lvl>
-    <w:lvl w:ilvl="2" w:tplc="6CCAF9A8">
-      <w:start w:val="1"/>
-      <w:numFmt w:val="bullet"/>
-      <w:lvlText w:val="■"/>
+    <w:lvl w:ilvl="2" w:tplc="F1ACD99A">
+      <w:numFmt w:val="decimal"/>
+      <w:lvlText w:val=""/>
       <w:lvlJc w:val="left"/>
-      <w:pPr>
-        <w:ind w:left="2160" w:hanging="360"/>
-      </w:pPr>
     </w:lvl>
-    <w:lvl w:ilvl="3" w:tplc="52F610D2">
-      <w:start w:val="1"/>
-      <w:numFmt w:val="bullet"/>
-      <w:lvlText w:val="●"/>
+    <w:lvl w:ilvl="3" w:tplc="AC5CC1C0">
+      <w:numFmt w:val="decimal"/>
+      <w:lvlText w:val=""/>
       <w:lvlJc w:val="left"/>
-      <w:pPr>
-        <w:ind w:left="2880" w:hanging="360"/>
-      </w:pPr>
     </w:lvl>
-    <w:lvl w:ilvl="4" w:tplc="C9F0A13A">
-      <w:start w:val="1"/>
-      <w:numFmt w:val="bullet"/>
-      <w:lvlText w:val="○"/>
+    <w:lvl w:ilvl="4" w:tplc="7736D6D4">
+      <w:numFmt w:val="decimal"/>
+      <w:lvlText w:val=""/>
       <w:lvlJc w:val="left"/>
-      <w:pPr>
-        <w:ind w:left="3600" w:hanging="360"/>
-      </w:pPr>
     </w:lvl>
-    <w:lvl w:ilvl="5" w:tplc="A6B8757A">
-      <w:start w:val="1"/>
-      <w:numFmt w:val="bullet"/>
-      <w:lvlText w:val="■"/>
+    <w:lvl w:ilvl="5" w:tplc="253A9F7C">
+      <w:numFmt w:val="decimal"/>
+      <w:lvlText w:val=""/>
       <w:lvlJc w:val="left"/>
-      <w:pPr>
-        <w:ind w:left="4320" w:hanging="360"/>
-      </w:pPr>
     </w:lvl>
-    <w:lvl w:ilvl="6" w:tplc="65B2CEBE">
-      <w:start w:val="1"/>
-      <w:numFmt w:val="bullet"/>
-      <w:lvlText w:val="●"/>
+    <w:lvl w:ilvl="6" w:tplc="05DC01AE">
+      <w:numFmt w:val="decimal"/>
+      <w:lvlText w:val=""/>
       <w:lvlJc w:val="left"/>
-      <w:pPr>
-        <w:ind w:left="5040" w:hanging="360"/>
-      </w:pPr>
     </w:lvl>
-    <w:lvl w:ilvl="7" w:tplc="CAA825CC">
-      <w:start w:val="1"/>
-      <w:numFmt w:val="bullet"/>
-      <w:lvlText w:val="●"/>
+    <w:lvl w:ilvl="7" w:tplc="DFFC5AC8">
+      <w:numFmt w:val="decimal"/>
+      <w:lvlText w:val=""/>
       <w:lvlJc w:val="left"/>
-      <w:pPr>
-        <w:ind w:left="5760" w:hanging="360"/>
-      </w:pPr>
     </w:lvl>
-    <w:lvl w:ilvl="8" w:tplc="5C1E4E12">
-      <w:start w:val="1"/>
-      <w:numFmt w:val="bullet"/>
-      <w:lvlText w:val="●"/>
+    <w:lvl w:ilvl="8" w:tplc="139825B6">
+      <w:numFmt w:val="decimal"/>
+      <w:lvlText w:val=""/>
       <w:lvlJc w:val="left"/>
-      <w:pPr>
-        <w:ind w:left="6480" w:hanging="360"/>
-      </w:pPr>
     </w:lvl>
   </w:abstractNum>
   <w:abstractNum w:abstractNumId="1" w15:restartNumberingAfterBreak="0">
-    <w:nsid w:val="481C2FD7"/>
+    <w:nsid w:val="456C73C5"/>
     <w:multiLevelType w:val="hybridMultilevel"/>
-    <w:tmpl w:val="104803E6"/>
-    <w:lvl w:ilvl="0" w:tplc="DB0CD6E4">
+    <w:tmpl w:val="439E6714"/>
+    <w:lvl w:ilvl="0" w:tplc="D6AE82F4">
       <w:start w:val="1"/>
       <w:numFmt w:val="decimal"/>
       <w:lvlText w:val="%1."/>
@@ -3834,120 +3834,152 @@
         <w:ind w:left="440" w:hanging="260"/>
       </w:pPr>
     </w:lvl>
-    <w:lvl w:ilvl="1" w:tplc="73308F5E">
+    <w:lvl w:ilvl="1" w:tplc="54220332">
       <w:numFmt w:val="decimal"/>
       <w:lvlText w:val=""/>
       <w:lvlJc w:val="left"/>
     </w:lvl>
-    <w:lvl w:ilvl="2" w:tplc="6B64686A">
+    <w:lvl w:ilvl="2" w:tplc="DDDA90B4">
       <w:numFmt w:val="decimal"/>
       <w:lvlText w:val=""/>
       <w:lvlJc w:val="left"/>
     </w:lvl>
-    <w:lvl w:ilvl="3" w:tplc="263A06DE">
+    <w:lvl w:ilvl="3" w:tplc="C5C8148A">
       <w:numFmt w:val="decimal"/>
       <w:lvlText w:val=""/>
       <w:lvlJc w:val="left"/>
     </w:lvl>
-    <w:lvl w:ilvl="4" w:tplc="C03428BA">
+    <w:lvl w:ilvl="4" w:tplc="35B83E5E">
       <w:numFmt w:val="decimal"/>
       <w:lvlText w:val=""/>
       <w:lvlJc w:val="left"/>
     </w:lvl>
-    <w:lvl w:ilvl="5" w:tplc="C172A54A">
+    <w:lvl w:ilvl="5" w:tplc="EE4C6A1A">
       <w:numFmt w:val="decimal"/>
       <w:lvlText w:val=""/>
       <w:lvlJc w:val="left"/>
     </w:lvl>
-    <w:lvl w:ilvl="6" w:tplc="A0CC517E">
+    <w:lvl w:ilvl="6" w:tplc="EABCD65C">
       <w:numFmt w:val="decimal"/>
       <w:lvlText w:val=""/>
       <w:lvlJc w:val="left"/>
     </w:lvl>
-    <w:lvl w:ilvl="7" w:tplc="D01A2AB6">
+    <w:lvl w:ilvl="7" w:tplc="4120D338">
       <w:numFmt w:val="decimal"/>
       <w:lvlText w:val=""/>
       <w:lvlJc w:val="left"/>
     </w:lvl>
-    <w:lvl w:ilvl="8" w:tplc="0C56B4FE">
+    <w:lvl w:ilvl="8" w:tplc="91504802">
       <w:numFmt w:val="decimal"/>
       <w:lvlText w:val=""/>
       <w:lvlJc w:val="left"/>
     </w:lvl>
   </w:abstractNum>
   <w:abstractNum w:abstractNumId="2" w15:restartNumberingAfterBreak="0">
-    <w:nsid w:val="4C8B35B5"/>
+    <w:nsid w:val="5EBF07C9"/>
     <w:multiLevelType w:val="hybridMultilevel"/>
-    <w:tmpl w:val="3EDC07D6"/>
-    <w:lvl w:ilvl="0" w:tplc="217C0A96">
+    <w:tmpl w:val="5110325E"/>
+    <w:lvl w:ilvl="0" w:tplc="A3906802">
       <w:start w:val="1"/>
       <w:numFmt w:val="bullet"/>
-      <w:lvlText w:val="•"/>
+      <w:lvlText w:val="●"/>
       <w:lvlJc w:val="left"/>
       <w:pPr>
-        <w:ind w:left="440" w:hanging="260"/>
+        <w:ind w:left="720" w:hanging="360"/>
       </w:pPr>
     </w:lvl>
-    <w:lvl w:ilvl="1" w:tplc="6F50EDEC">
-      <w:numFmt w:val="decimal"/>
-      <w:lvlText w:val=""/>
+    <w:lvl w:ilvl="1" w:tplc="73A60788">
+      <w:start w:val="1"/>
+      <w:numFmt w:val="bullet"/>
+      <w:lvlText w:val="○"/>
       <w:lvlJc w:val="left"/>
+      <w:pPr>
+        <w:ind w:left="1440" w:hanging="360"/>
+      </w:pPr>
     </w:lvl>
-    <w:lvl w:ilvl="2" w:tplc="17DA505E">
-      <w:numFmt w:val="decimal"/>
-      <w:lvlText w:val=""/>
+    <w:lvl w:ilvl="2" w:tplc="29642BDA">
+      <w:start w:val="1"/>
+      <w:numFmt w:val="bullet"/>
+      <w:lvlText w:val="■"/>
       <w:lvlJc w:val="left"/>
+      <w:pPr>
+        <w:ind w:left="2160" w:hanging="360"/>
+      </w:pPr>
     </w:lvl>
-    <w:lvl w:ilvl="3" w:tplc="B0DEC13A">
-      <w:numFmt w:val="decimal"/>
-      <w:lvlText w:val=""/>
+    <w:lvl w:ilvl="3" w:tplc="D0F6FD54">
+      <w:start w:val="1"/>
+      <w:numFmt w:val="bullet"/>
+      <w:lvlText w:val="●"/>
       <w:lvlJc w:val="left"/>
+      <w:pPr>
+        <w:ind w:left="2880" w:hanging="360"/>
+      </w:pPr>
     </w:lvl>
-    <w:lvl w:ilvl="4" w:tplc="7A187A6A">
-      <w:numFmt w:val="decimal"/>
-      <w:lvlText w:val=""/>
+    <w:lvl w:ilvl="4" w:tplc="4A6C8046">
+      <w:start w:val="1"/>
+      <w:numFmt w:val="bullet"/>
+      <w:lvlText w:val="○"/>
       <w:lvlJc w:val="left"/>
+      <w:pPr>
+        <w:ind w:left="3600" w:hanging="360"/>
+      </w:pPr>
     </w:lvl>
-    <w:lvl w:ilvl="5" w:tplc="CE426F2E">
-      <w:numFmt w:val="decimal"/>
-      <w:lvlText w:val=""/>
+    <w:lvl w:ilvl="5" w:tplc="9738B412">
+      <w:start w:val="1"/>
+      <w:numFmt w:val="bullet"/>
+      <w:lvlText w:val="■"/>
       <w:lvlJc w:val="left"/>
+      <w:pPr>
+        <w:ind w:left="4320" w:hanging="360"/>
+      </w:pPr>
     </w:lvl>
-    <w:lvl w:ilvl="6" w:tplc="D22EA8DE">
-      <w:numFmt w:val="decimal"/>
-      <w:lvlText w:val=""/>
+    <w:lvl w:ilvl="6" w:tplc="C99626A4">
+      <w:start w:val="1"/>
+      <w:numFmt w:val="bullet"/>
+      <w:lvlText w:val="●"/>
       <w:lvlJc w:val="left"/>
+      <w:pPr>
+        <w:ind w:left="5040" w:hanging="360"/>
+      </w:pPr>
     </w:lvl>
-    <w:lvl w:ilvl="7" w:tplc="FD1CAE7C">
-      <w:numFmt w:val="decimal"/>
-      <w:lvlText w:val=""/>
+    <w:lvl w:ilvl="7" w:tplc="EC309B2C">
+      <w:start w:val="1"/>
+      <w:numFmt w:val="bullet"/>
+      <w:lvlText w:val="●"/>
       <w:lvlJc w:val="left"/>
+      <w:pPr>
+        <w:ind w:left="5760" w:hanging="360"/>
+      </w:pPr>
     </w:lvl>
-    <w:lvl w:ilvl="8" w:tplc="55B6B26C">
-      <w:numFmt w:val="decimal"/>
-      <w:lvlText w:val=""/>
+    <w:lvl w:ilvl="8" w:tplc="8CBA2642">
+      <w:start w:val="1"/>
+      <w:numFmt w:val="bullet"/>
+      <w:lvlText w:val="●"/>
       <w:lvlJc w:val="left"/>
+      <w:pPr>
+        <w:ind w:left="6480" w:hanging="360"/>
+      </w:pPr>
     </w:lvl>
   </w:abstractNum>
-  <w:num w:numId="1" w16cid:durableId="1282415044">
+  <w:num w:numId="1" w16cid:durableId="1275674587">
+    <w:abstractNumId w:val="2"/>
+    <w:lvlOverride w:ilvl="0">
+      <w:startOverride w:val="1"/>
+    </w:lvlOverride>
+  </w:num>
+  <w:num w:numId="2" w16cid:durableId="1849102119">
+    <w:abstractNumId w:val="1"/>
+    <w:lvlOverride w:ilvl="0">
+      <w:startOverride w:val="1"/>
+    </w:lvlOverride>
+  </w:num>
+  <w:num w:numId="3" w16cid:durableId="1972132097">
     <w:abstractNumId w:val="0"/>
     <w:lvlOverride w:ilvl="0">
       <w:startOverride w:val="1"/>
     </w:lvlOverride>
   </w:num>
-  <w:num w:numId="2" w16cid:durableId="1899658021">
-    <w:abstractNumId w:val="1"/>
-    <w:lvlOverride w:ilvl="0">
-      <w:startOverride w:val="1"/>
-    </w:lvlOverride>
-  </w:num>
-  <w:num w:numId="3" w16cid:durableId="836578934">
-    <w:abstractNumId w:val="2"/>
-    <w:lvlOverride w:ilvl="0">
-      <w:startOverride w:val="1"/>
-    </w:lvlOverride>
-  </w:num>
-  <w:num w:numId="4" w16cid:durableId="1422988020">
+  <w:num w:numId="4" w16cid:durableId="452670916">
     <w:abstractNumId w:val="1"/>
     <w:lvlOverride w:ilvl="0">
       <w:startOverride w:val="1"/>
@@ -4565,7 +4597,7 @@
     <w:autoRedefine/>
     <w:uiPriority w:val="39"/>
     <w:unhideWhenUsed/>
-    <w:rsid w:val="00D826A6"/>
+    <w:rsid w:val="003F4E3F"/>
     <w:pPr>
       <w:spacing w:after="100"/>
     </w:pPr>
@@ -4577,7 +4609,7 @@
     <w:autoRedefine/>
     <w:uiPriority w:val="39"/>
     <w:unhideWhenUsed/>
-    <w:rsid w:val="00D826A6"/>
+    <w:rsid w:val="003F4E3F"/>
     <w:pPr>
       <w:spacing w:after="100"/>
       <w:ind w:left="220"/>

</xml_diff>